<commit_message>
cut down report to two pages (conclusion went onto 3rd page before)
</commit_message>
<xml_diff>
--- a/HW4/HW4_report.docx
+++ b/HW4/HW4_report.docx
@@ -14,56 +14,6 @@
           <w:sz w:val="28"/>
         </w:rPr>
         <w:t>DSC 291 HW4: XGBoost Taxi Type Classification</w:t>
-      </w:r>
-    </w:p>
-    <w:p>
-      <w:pPr>
-        <w:spacing w:after="120"/>
-        <w:jc w:val="center"/>
-      </w:pPr>
-      <w:r>
-        <w:rPr>
-          <w:i/>
-        </w:rPr>
-        <w:t>DSC 291</w:t>
-      </w:r>
-      <w:r>
-        <w:rPr>
-          <w:i/>
-        </w:rPr>
-        <w:t>:</w:t>
-      </w:r>
-      <w:r>
-        <w:rPr>
-          <w:i/>
-        </w:rPr>
-        <w:t xml:space="preserve"> Big Data </w:t>
-      </w:r>
-      <w:proofErr w:type="gramStart"/>
-      <w:r>
-        <w:rPr>
-          <w:i/>
-        </w:rPr>
-        <w:t>Analytics  |</w:t>
-      </w:r>
-      <w:proofErr w:type="gramEnd"/>
-      <w:r>
-        <w:rPr>
-          <w:i/>
-        </w:rPr>
-        <w:t xml:space="preserve">  March</w:t>
-      </w:r>
-      <w:r>
-        <w:rPr>
-          <w:i/>
-        </w:rPr>
-        <w:t xml:space="preserve"> 11,</w:t>
-      </w:r>
-      <w:r>
-        <w:rPr>
-          <w:i/>
-        </w:rPr>
-        <w:t xml:space="preserve"> 2026</w:t>
       </w:r>
     </w:p>
     <w:p>
@@ -94,7 +44,7 @@
           <w:color w:val="1F497D"/>
           <w:sz w:val="26"/>
         </w:rPr>
-        <w:t>Part A — Raw Trip-Level Classification</w:t>
+        <w:t>Part A: Raw Trip-Level Classification</w:t>
       </w:r>
     </w:p>
     <w:p>
@@ -417,7 +367,7 @@
     </w:p>
     <w:p>
       <w:r>
-        <w:t>trip_duration_min was the single most important split feature, followed by trip_distance and hour. day_of_week and passenger_count contributed less. A five-point grid search over max_depth ∈ {4, 6, 8} and learning_rate ∈ {0.05, 0.10} showed that deeper trees with a higher learning rate consistently improved accuracy, with max_depth = 8, η = 0.10 reaching 76.6% accuracy and 76.5% macro-F1.</w:t>
+        <w:t>trip_duration_min was the top split feature, followed by trip_distance and hour; day_of_week and passenger_count contributed less. A grid search over max_depth in {4, 6, 8} and learning_rate in {0.05, 0.10} found max_depth = 8, lr = 0.10 reached 76.6% accuracy and 76.5% macro-F1.</w:t>
       </w:r>
     </w:p>
     <w:p>
@@ -435,7 +385,7 @@
     </w:p>
     <w:p>
       <w:r>
-        <w:t>Two stability analyses were performed. First, 200 test-set bootstrap resamples of the default model yielded accuracy 0.7774 ± 0.0031 (95% CI: [0.7714, 0.7836]), confirming low variance. Second, an ensemble of 30 models each trained on a bootstrap resample of the training set achieved mean accuracy 0.7531 (95% CI: [0.7476, 0.7596]) with mean ensemble prediction confidence 0.6854, indicating the model is moderately uncertain — consistent with partial overlap between the two classes in trip-level feature space.</w:t>
+        <w:t>Test-set bootstrap resampling (200 iterations) confirmed low variance: accuracy 0.7774 +/- 0.0031 (95% CI: [0.7714, 0.7836]). A 30-model training-bootstrap ensemble reached mean accuracy 0.7531 with mean confidence 0.6854, reflecting partial class overlap.</w:t>
       </w:r>
     </w:p>
     <w:p>
@@ -448,12 +398,12 @@
           <w:color w:val="1F497D"/>
           <w:sz w:val="26"/>
         </w:rPr>
-        <w:t>Part B — Hourly Profile Classification via PCA</w:t>
+        <w:t>Part B: Hourly Profile Classification via PCA</w:t>
       </w:r>
     </w:p>
     <w:p>
       <w:r>
-        <w:t>The HW1 wide Parquet table (2,053,698 yellow + green rows) provides a 24-dimensional hourly ride-count profile per (date, taxi_type, pickup_place). Each row was converted to an hourly proportion vector (counts ÷ daily total) to remove scale differences. PCA was fit on the training split only to prevent data leakage, and the top 5 principal components were used as XGBoost features. The same 80/20 stratified split (random_state = 42) was applied.</w:t>
+        <w:t>The HW1 wide table (2,053,698 rows) provides a 24-dimensional hourly ride-count profile per (date, taxi_type, pickup_place). Each row was normalized to hourly proportions to remove scale differences. PCA was fit on the training split only to prevent leakage; the top 5 components were used as features.</w:t>
       </w:r>
     </w:p>
     <w:p>
@@ -646,7 +596,6 @@
               <w:rPr>
                 <w:sz w:val="18"/>
               </w:rPr>
-              <w:lastRenderedPageBreak/>
               <w:t>PC3</w:t>
             </w:r>
           </w:p>
@@ -697,6 +646,7 @@
               <w:rPr>
                 <w:sz w:val="18"/>
               </w:rPr>
+              <w:lastRenderedPageBreak/>
               <w:t>PC4</w:t>
             </w:r>
           </w:p>
@@ -1151,7 +1101,6 @@
         </w:tc>
       </w:tr>
     </w:tbl>
-    <w:p/>
     <w:p>
       <w:pPr>
         <w:pStyle w:val="Heading1"/>
@@ -1162,7 +1111,7 @@
           <w:color w:val="1F497D"/>
           <w:sz w:val="26"/>
         </w:rPr>
-        <w:t>Extra Credit — Metadata-Augmented Part B Model</w:t>
+        <w:t>Extra Credit: Metadata-Augmented Part B Model</w:t>
       </w:r>
     </w:p>
     <w:p>
@@ -1185,7 +1134,7 @@
     </w:p>
     <w:p>
       <w:r>
-        <w:t>Adding spatial and calendar context caused a dramatic improvement. Overall accuracy rose to 99.2% and, critically, green recall jumped from 5% to 96% — meaning the model now reliably identifies green taxis. Yellow recall remained at 100%. Both macro precision and macro recall reached 0.98.</w:t>
+        <w:t>Adding spatial and calendar context caused a dramatic improvement. Overall accuracy rose to 99.2% and, critically, green recall jumped from 5% to 96%, meaning the model now reliably identifies green taxis. Yellow recall remained at 100%. Both macro precision and macro recall reached 0.98.</w:t>
       </w:r>
     </w:p>
     <w:tbl>
@@ -1535,7 +1484,6 @@
         </w:tc>
       </w:tr>
     </w:tbl>
-    <w:p/>
     <w:p>
       <w:pPr>
         <w:pStyle w:val="Heading2"/>
@@ -1569,27 +1517,27 @@
     </w:p>
     <w:p>
       <w:r>
-        <w:t>Bootstrap resampling of the test set (200 iterations) showed that the augmented model is extremely stable: accuracy 0.9923 ± 0.0001 (95% CI: [0.9921, 0.9926]) and weighted F1 0.9923 ± 0.0001 (95% CI: [0.9921, 0.9926]). Analysis of ensemble prediction confidence revealed a large gap between correct predictions (mean max-probability 0.988 ± 0.049) and incorrect predictions (0.687 ± 0.135), indicating that the model is well-calibrated — high confidence correlates strongly with correctness, and most errors occur near the decision boundary.</w:t>
+        <w:t>Bootstrap resampling (200 iterations) confirmed high stability: accuracy 0.9923 +/- 0.0001 and weighted F1 0.9923 +/- 0.0001. Ensemble confidence analysis showed correct predictions averaged 0.988 vs. 0.687 for incorrect ones, confirming the model is well-calibrated with most errors near the decision boundary.</w:t>
       </w:r>
     </w:p>
     <w:p>
       <w:pPr>
         <w:pStyle w:val="Heading1"/>
-        <w:spacing w:before="120" w:after="40"/>
+        <w:spacing w:before="0" w:after="40"/>
       </w:pPr>
       <w:r>
         <w:rPr>
           <w:color w:val="1F497D"/>
           <w:sz w:val="26"/>
         </w:rPr>
-        <w:lastRenderedPageBreak/>
         <w:t>Conclusion</w:t>
       </w:r>
     </w:p>
     <w:p>
       <w:r>
-        <w:t>Part A demonstrates that raw trip features (particularly trip duration and distance) encode moderate taxi-type signal (~78% balanced accuracy), though the two classes overlap substantially in feature space. Part B shows that hourly ride-count profiles alone are insufficient when class imbalance is severe: high overall accuracy masks near-zero green recall. The extra-credit augmentation resolves this by incorporating spatial location, which reflects the regulated geographic boundaries of NYC taxi service. The key takeaway is that accuracy is a misleading metric under imbalance; macro-F1 and per-class recall are essential, and domain-relevant features (spatial position) can be decisive.</w:t>
+        <w:t>Part A shows raw trip features (especially trip duration and distance) encode moderate taxi-type signal (~78% accuracy), though classes overlap substantially. Part B reveals hourly profiles alone are insufficient under severe class imbalance, as high overall accuracy masks near-zero green recall. The extra-credit model resolves this with spatial features, reflecting NYC's geographic taxi boundaries. Key takeaway: under imbalance, per-class recall and macro-F1 outweigh accuracy.</w:t>
       </w:r>
+      <w:r/>
     </w:p>
     <w:sectPr>
       <w:pgSz w:w="12240" w:h="15840"/>

</xml_diff>